<commit_message>
GDD to v1.2 with mechanic overhauls
</commit_message>
<xml_diff>
--- a/docs/The_Adventure_of_Lazy_GDD_and_Narrative.md.docx
+++ b/docs/The_Adventure_of_Lazy_GDD_and_Narrative.md.docx
@@ -46,7 +46,7 @@
         <w:rPr>
           <w:rtl w:val="0"/>
         </w:rPr>
-        <w:t xml:space="preserve"> 1.1 (revised) </w:t>
+        <w:t xml:space="preserve"> 1.2 (revised 18.10.2026) </w:t>
       </w:r>
       <w:r>
         <w:rPr>
@@ -88,7 +88,7 @@
         <w:rPr>
           <w:rtl w:val="0"/>
         </w:rPr>
-        <w:t xml:space="preserve"> Godot 4.6 </w:t>
+        <w:t xml:space="preserve"> Godot 4.7 </w:t>
       </w:r>
       <w:r>
         <w:rPr>
@@ -1619,6 +1619,82 @@
     </w:p>
     <w:p>
       <w:pPr>
+        <w:numPr>
+          <w:ilvl w:val="0"/>
+          <w:numId w:val="1"/>
+        </w:numPr>
+        <w:ind w:left="720" w:hanging="360"/>
+        <w:rPr/>
+      </w:pPr>
+      <w:r>
+        <w:rPr>
+          <w:b w:val="1"/>
+          <w:bCs w:val="1"/>
+          <w:rtl w:val="0"/>
+        </w:rPr>
+        <w:t>Crouch:</w:t>
+      </w:r>
+      <w:r>
+        <w:rPr>
+          <w:rtl w:val="0"/>
+        </w:rPr>
+        <w:t xml:space="preserve"> </w:t>
+      </w:r>
+      <w:r>
+        <w:rPr>
+          <w:b w:val="1"/>
+          <w:bCs w:val="1"/>
+          <w:rtl w:val="0"/>
+        </w:rPr>
+        <w:t>Ctrl</w:t>
+      </w:r>
+      <w:r>
+        <w:rPr>
+          <w:rtl w:val="0"/>
+        </w:rPr>
+        <w:t xml:space="preserve"> toggles crouching. Crouching lowers the view so the player can look under furniture, such as the bed, even though the camera is third-person.</w:t>
+      </w:r>
+    </w:p>
+    <w:p>
+      <w:pPr>
+        <w:numPr>
+          <w:ilvl w:val="0"/>
+          <w:numId w:val="1"/>
+        </w:numPr>
+        <w:ind w:left="720" w:hanging="360"/>
+        <w:rPr/>
+      </w:pPr>
+      <w:r>
+        <w:rPr>
+          <w:b w:val="1"/>
+          <w:bCs w:val="1"/>
+          <w:rtl w:val="0"/>
+        </w:rPr>
+        <w:t>Jump:</w:t>
+      </w:r>
+      <w:r>
+        <w:rPr>
+          <w:rtl w:val="0"/>
+        </w:rPr>
+        <w:t xml:space="preserve"> </w:t>
+      </w:r>
+      <w:r>
+        <w:rPr>
+          <w:b w:val="1"/>
+          <w:bCs w:val="1"/>
+          <w:rtl w:val="0"/>
+        </w:rPr>
+        <w:t>Space</w:t>
+      </w:r>
+      <w:r>
+        <w:rPr>
+          <w:rtl w:val="0"/>
+        </w:rPr>
+        <w:t xml:space="preserve"> works only inside specially marked jump zones, where the player has to jump to get past an obstacle. Free jumping is disabled. Each jump costs Stamina.</w:t>
+      </w:r>
+    </w:p>
+    <w:p>
+      <w:pPr>
         <w:pStyle w:val="Heading3"/>
         <w:rPr/>
       </w:pPr>
@@ -1838,7 +1914,7 @@
               <w:rPr>
                 <w:rtl w:val="0"/>
               </w:rPr>
-              <w:t xml:space="preserve">Open/close the inventory carousel (4 slots)</w:t>
+              <w:t>Open/close the journal: a list of every note collected so far. Selecting a note opens it in the pages viewer. The game pauses while the journal is open.</w:t>
             </w:r>
           </w:p>
         </w:tc>
@@ -1901,6 +1977,128 @@
                 <w:rtl w:val="0"/>
               </w:rPr>
               <w:t xml:space="preserve">Sprint</w:t>
+            </w:r>
+          </w:p>
+        </w:tc>
+      </w:tr>
+      <w:tr>
+        <w:trPr>
+          <w:cantSplit w:val="0"/>
+          <w:tblHeader w:val="0"/>
+        </w:trPr>
+        <w:tc>
+          <w:tcPr>
+            <w:shd w:fill="auto" w:val="clear"/>
+            <w:tcMar>
+              <w:top w:w="100.0" w:type="dxa"/>
+              <w:left w:w="100.0" w:type="dxa"/>
+              <w:bottom w:w="100.0" w:type="dxa"/>
+              <w:right w:w="100.0" w:type="dxa"/>
+            </w:tcMar>
+            <w:vAlign w:val="top"/>
+          </w:tcPr>
+          <w:p>
+            <w:pPr>
+              <w:jc w:val="left"/>
+              <w:rPr/>
+            </w:pPr>
+            <w:r>
+              <w:rPr>
+                <w:b w:val="1"/>
+                <w:bCs w:val="1"/>
+                <w:rtl w:val="0"/>
+              </w:rPr>
+              <w:t>Ctrl</w:t>
+            </w:r>
+            <w:r>
+              <w:rPr>
+                <w:rtl w:val="0"/>
+              </w:rPr>
+            </w:r>
+          </w:p>
+        </w:tc>
+        <w:tc>
+          <w:tcPr>
+            <w:shd w:fill="auto" w:val="clear"/>
+            <w:tcMar>
+              <w:top w:w="100.0" w:type="dxa"/>
+              <w:left w:w="100.0" w:type="dxa"/>
+              <w:bottom w:w="100.0" w:type="dxa"/>
+              <w:right w:w="100.0" w:type="dxa"/>
+            </w:tcMar>
+            <w:vAlign w:val="top"/>
+          </w:tcPr>
+          <w:p>
+            <w:pPr>
+              <w:jc w:val="left"/>
+              <w:rPr/>
+            </w:pPr>
+            <w:r>
+              <w:rPr>
+                <w:rtl w:val="0"/>
+              </w:rPr>
+              <w:t>Crouch / stand up (toggle); lets the player look under furniture</w:t>
+            </w:r>
+          </w:p>
+        </w:tc>
+      </w:tr>
+      <w:tr>
+        <w:trPr>
+          <w:cantSplit w:val="0"/>
+          <w:tblHeader w:val="0"/>
+        </w:trPr>
+        <w:tc>
+          <w:tcPr>
+            <w:shd w:fill="auto" w:val="clear"/>
+            <w:tcMar>
+              <w:top w:w="100.0" w:type="dxa"/>
+              <w:left w:w="100.0" w:type="dxa"/>
+              <w:bottom w:w="100.0" w:type="dxa"/>
+              <w:right w:w="100.0" w:type="dxa"/>
+            </w:tcMar>
+            <w:vAlign w:val="top"/>
+          </w:tcPr>
+          <w:p>
+            <w:pPr>
+              <w:jc w:val="left"/>
+              <w:rPr/>
+            </w:pPr>
+            <w:r>
+              <w:rPr>
+                <w:b w:val="1"/>
+                <w:bCs w:val="1"/>
+                <w:rtl w:val="0"/>
+              </w:rPr>
+              <w:t>Space</w:t>
+            </w:r>
+            <w:r>
+              <w:rPr>
+                <w:rtl w:val="0"/>
+              </w:rPr>
+            </w:r>
+          </w:p>
+        </w:tc>
+        <w:tc>
+          <w:tcPr>
+            <w:shd w:fill="auto" w:val="clear"/>
+            <w:tcMar>
+              <w:top w:w="100.0" w:type="dxa"/>
+              <w:left w:w="100.0" w:type="dxa"/>
+              <w:bottom w:w="100.0" w:type="dxa"/>
+              <w:right w:w="100.0" w:type="dxa"/>
+            </w:tcMar>
+            <w:vAlign w:val="top"/>
+          </w:tcPr>
+          <w:p>
+            <w:pPr>
+              <w:jc w:val="left"/>
+              <w:rPr/>
+            </w:pPr>
+            <w:r>
+              <w:rPr>
+                <w:rtl w:val="0"/>
+              </w:rPr>
+              <w:t>Jump (marked jump zones only)</w:t>
             </w:r>
           </w:p>
         </w:tc>
@@ -1962,7 +2160,7 @@
               <w:rPr>
                 <w:rtl w:val="0"/>
               </w:rPr>
-              <w:t xml:space="preserve">Close the notes/pages viewer</w:t>
+              <w:t>Close the notes/pages viewer or the journal</w:t>
             </w:r>
           </w:p>
         </w:tc>
@@ -2215,7 +2413,7 @@
                 <w:rFonts w:ascii="Arial Unicode MS" w:cs="Arial Unicode MS" w:eastAsia="Arial Unicode MS" w:hAnsi="Arial Unicode MS"/>
                 <w:rtl w:val="0"/>
               </w:rPr>
-              <w:t xml:space="preserve">Falling 4m+; Screamer encounter (−25)</w:t>
+              <w:t>Fear damage: small random hits at random intervals (see 3.4); Screamer encounter (−25)</w:t>
             </w:r>
             <w:r>
               <w:rPr>
@@ -2329,134 +2527,242 @@
               <w:rPr>
                 <w:rtl w:val="0"/>
               </w:rPr>
-              <w:t xml:space="preserve">Continuous run time: 4–7 seconds. Flow rate per second: 15%–25% of the total scale volume.;</w:t>
-            </w:r>
-          </w:p>
-          <w:p>
-            <w:pPr>
-              <w:jc w:val="left"/>
-              <w:rPr/>
-            </w:pPr>
-            <w:r>
-              <w:rPr>
-                <w:rtl w:val="0"/>
-              </w:rPr>
-            </w:r>
-          </w:p>
-          <w:p>
-            <w:pPr>
-              <w:jc w:val="left"/>
-              <w:rPr/>
-            </w:pPr>
-            <w:r>
-              <w:rPr>
-                <w:rtl w:val="0"/>
-              </w:rPr>
-              <w:t xml:space="preserve">Flow rate per jump/impact: 20% of the scale;</w:t>
-            </w:r>
-          </w:p>
-          <w:p>
-            <w:pPr>
-              <w:jc w:val="left"/>
-              <w:rPr/>
-            </w:pPr>
-            <w:r>
-              <w:rPr>
-                <w:rtl w:val="0"/>
-              </w:rPr>
-            </w:r>
-          </w:p>
-          <w:p>
-            <w:pPr>
-              <w:jc w:val="left"/>
-              <w:rPr/>
-            </w:pPr>
-            <w:r>
-              <w:rPr>
-                <w:rtl w:val="0"/>
-              </w:rPr>
-              <w:t xml:space="preserve">lifting heavy objects</w:t>
-            </w:r>
-          </w:p>
-          <w:p>
-            <w:pPr>
-              <w:jc w:val="left"/>
-              <w:rPr/>
-            </w:pPr>
-            <w:r>
-              <w:rPr>
-                <w:rtl w:val="0"/>
-              </w:rPr>
-            </w:r>
-          </w:p>
-          <w:p>
-            <w:pPr>
-              <w:rPr/>
-            </w:pPr>
-            <w:r>
-              <w:rPr>
-                <w:rtl w:val="0"/>
-              </w:rPr>
-            </w:r>
-          </w:p>
-          <w:p>
-            <w:pPr>
-              <w:rPr/>
-            </w:pPr>
-            <w:r>
-              <w:rPr>
-                <w:rtl w:val="0"/>
-              </w:rPr>
-            </w:r>
-          </w:p>
-          <w:p>
-            <w:pPr>
-              <w:rPr/>
-            </w:pPr>
-            <w:r>
-              <w:rPr>
-                <w:rtl w:val="0"/>
-              </w:rPr>
-            </w:r>
-          </w:p>
-          <w:p>
-            <w:pPr>
-              <w:jc w:val="left"/>
-              <w:rPr/>
-            </w:pPr>
-            <w:r>
-              <w:rPr>
-                <w:rtl w:val="0"/>
-              </w:rPr>
-            </w:r>
-          </w:p>
-        </w:tc>
-        <w:tc>
-          <w:tcPr>
-            <w:shd w:fill="auto" w:val="clear"/>
-            <w:tcMar>
-              <w:top w:w="100.0" w:type="dxa"/>
-              <w:left w:w="100.0" w:type="dxa"/>
-              <w:bottom w:w="100.0" w:type="dxa"/>
-              <w:right w:w="100.0" w:type="dxa"/>
-            </w:tcMar>
-            <w:vAlign w:val="top"/>
-          </w:tcPr>
-          <w:p>
-            <w:pPr>
-              <w:jc w:val="left"/>
-              <w:rPr/>
-            </w:pPr>
-            <w:r>
-              <w:rPr>
-                <w:rtl w:val="0"/>
-              </w:rPr>
-              <w:t xml:space="preserve">After standing still for 5 seconds</w:t>
+              <w:t>Continuous running: empties the bar in 4–7 seconds (15%–25% of the bar per second);</w:t>
+            </w:r>
+          </w:p>
+          <w:p>
+            <w:pPr>
+              <w:jc w:val="left"/>
+              <w:rPr/>
+            </w:pPr>
+            <w:r>
+              <w:rPr>
+                <w:rtl w:val="0"/>
+              </w:rPr>
+            </w:r>
+          </w:p>
+          <w:p>
+            <w:pPr>
+              <w:jc w:val="left"/>
+              <w:rPr/>
+            </w:pPr>
+            <w:r>
+              <w:rPr>
+                <w:rtl w:val="0"/>
+              </w:rPr>
+              <w:t>Each jump: 20% of the bar;</w:t>
+            </w:r>
+          </w:p>
+          <w:p>
+            <w:pPr>
+              <w:jc w:val="left"/>
+              <w:rPr/>
+            </w:pPr>
+            <w:r>
+              <w:rPr>
+                <w:rtl w:val="0"/>
+              </w:rPr>
+            </w:r>
+          </w:p>
+          <w:p>
+            <w:pPr>
+              <w:jc w:val="left"/>
+              <w:rPr/>
+            </w:pPr>
+            <w:r>
+              <w:rPr>
+                <w:rtl w:val="0"/>
+              </w:rPr>
+              <w:t>Pushing heavy objects</w:t>
+            </w:r>
+          </w:p>
+          <w:p>
+            <w:pPr>
+              <w:jc w:val="left"/>
+              <w:rPr/>
+            </w:pPr>
+            <w:r>
+              <w:rPr>
+                <w:rtl w:val="0"/>
+              </w:rPr>
+            </w:r>
+          </w:p>
+          <w:p>
+            <w:pPr>
+              <w:rPr/>
+            </w:pPr>
+            <w:r>
+              <w:rPr>
+                <w:rtl w:val="0"/>
+              </w:rPr>
+            </w:r>
+          </w:p>
+          <w:p>
+            <w:pPr>
+              <w:rPr/>
+            </w:pPr>
+            <w:r>
+              <w:rPr>
+                <w:rtl w:val="0"/>
+              </w:rPr>
+            </w:r>
+          </w:p>
+          <w:p>
+            <w:pPr>
+              <w:rPr/>
+            </w:pPr>
+            <w:r>
+              <w:rPr>
+                <w:rtl w:val="0"/>
+              </w:rPr>
+            </w:r>
+          </w:p>
+          <w:p>
+            <w:pPr>
+              <w:jc w:val="left"/>
+              <w:rPr/>
+            </w:pPr>
+            <w:r>
+              <w:rPr>
+                <w:rtl w:val="0"/>
+              </w:rPr>
+            </w:r>
+          </w:p>
+        </w:tc>
+        <w:tc>
+          <w:tcPr>
+            <w:shd w:fill="auto" w:val="clear"/>
+            <w:tcMar>
+              <w:top w:w="100.0" w:type="dxa"/>
+              <w:left w:w="100.0" w:type="dxa"/>
+              <w:bottom w:w="100.0" w:type="dxa"/>
+              <w:right w:w="100.0" w:type="dxa"/>
+            </w:tcMar>
+            <w:vAlign w:val="top"/>
+          </w:tcPr>
+          <w:p>
+            <w:pPr>
+              <w:jc w:val="left"/>
+              <w:rPr/>
+            </w:pPr>
+            <w:r>
+              <w:rPr>
+                <w:rtl w:val="0"/>
+              </w:rPr>
+              <w:t>Whenever the player is not running. Standing still: full refill in about 5 seconds. Walking: slower, full refill in about 12 seconds.</w:t>
             </w:r>
           </w:p>
         </w:tc>
       </w:tr>
     </w:tbl>
+    <w:p>
+      <w:pPr>
+        <w:pStyle w:val="Heading3"/>
+        <w:rPr/>
+      </w:pPr>
+      <w:r>
+        <w:rPr>
+          <w:rtl w:val="0"/>
+        </w:rPr>
+        <w:t>3.4 Fear Damage</w:t>
+      </w:r>
+    </w:p>
+    <w:p>
+      <w:pPr>
+        <w:numPr>
+          <w:ilvl w:val="0"/>
+          <w:numId w:val="1"/>
+        </w:numPr>
+        <w:ind w:left="720" w:hanging="360"/>
+        <w:rPr/>
+      </w:pPr>
+      <w:r>
+        <w:rPr>
+          <w:b w:val="1"/>
+          <w:bCs w:val="1"/>
+          <w:rtl w:val="0"/>
+        </w:rPr>
+        <w:t>Rule:</w:t>
+      </w:r>
+      <w:r>
+        <w:rPr>
+          <w:rtl w:val="0"/>
+        </w:rPr>
+        <w:t xml:space="preserve"> While the game is running, the player loses a small, random amount of Health at random intervals (for example, −10 after 10 seconds, then −3 after 17 seconds). It represents the fear and pressure of the house.</w:t>
+      </w:r>
+    </w:p>
+    <w:p>
+      <w:pPr>
+        <w:numPr>
+          <w:ilvl w:val="0"/>
+          <w:numId w:val="1"/>
+        </w:numPr>
+        <w:ind w:left="720" w:hanging="360"/>
+        <w:rPr/>
+      </w:pPr>
+      <w:r>
+        <w:rPr>
+          <w:b w:val="1"/>
+          <w:bCs w:val="1"/>
+          <w:rtl w:val="0"/>
+        </w:rPr>
+        <w:t>Pause:</w:t>
+      </w:r>
+      <w:r>
+        <w:rPr>
+          <w:rtl w:val="0"/>
+        </w:rPr>
+        <w:t xml:space="preserve"> Fear damage stops while the journal or the pages viewer is open. The game is paused, but the audio keeps playing.</w:t>
+      </w:r>
+    </w:p>
+    <w:p>
+      <w:pPr>
+        <w:numPr>
+          <w:ilvl w:val="0"/>
+          <w:numId w:val="1"/>
+        </w:numPr>
+        <w:ind w:left="720" w:hanging="360"/>
+        <w:rPr/>
+      </w:pPr>
+      <w:r>
+        <w:rPr>
+          <w:b w:val="1"/>
+          <w:bCs w:val="1"/>
+          <w:rtl w:val="0"/>
+        </w:rPr>
+        <w:t>Feedback:</w:t>
+      </w:r>
+      <w:r>
+        <w:rPr>
+          <w:rtl w:val="0"/>
+        </w:rPr>
+        <w:t xml:space="preserve"> Each time Health drops, red blotches appear across the whole screen and fade out, in the style of The Evil Within and Amnesia. The Screamer's permanent red blotches (Section 7.1) use the same visual language.</w:t>
+      </w:r>
+    </w:p>
+    <w:p>
+      <w:pPr>
+        <w:numPr>
+          <w:ilvl w:val="0"/>
+          <w:numId w:val="1"/>
+        </w:numPr>
+        <w:ind w:left="720" w:hanging="360"/>
+        <w:rPr/>
+      </w:pPr>
+      <w:r>
+        <w:rPr>
+          <w:b w:val="1"/>
+          <w:bCs w:val="1"/>
+          <w:rtl w:val="0"/>
+        </w:rPr>
+        <w:t>Tuning:</w:t>
+      </w:r>
+      <w:r>
+        <w:rPr>
+          <w:rtl w:val="0"/>
+        </w:rPr>
+        <w:t xml:space="preserve"> The size and timing ranges are set during playtesting and are not final. Falling damage no longer exists.</w:t>
+      </w:r>
+    </w:p>
     <w:p>
       <w:pPr>
         <w:keepNext w:val="0"/>
@@ -3510,7 +3816,7 @@
         <w:rPr>
           <w:rtl w:val="0"/>
         </w:rPr>
-        <w:t xml:space="preserve"> After the player reads Note #4, an unsettling ambient cue begins. The player opens the final door partway; beyond it is only darkness, held for several seconds under the same ambient cue. The screen fades and the credits roll over a semi-transparent view of the house — the implication being that the player has taken the key despite the warning, and something is now following them out.</w:t>
+        <w:t xml:space="preserve"> After the player reads Note #4, an unsettling ambient cue begins. The player opens the final door partway; beyond it is only darkness, held for several seconds under the same ambient cue. The screen fades and the credits roll over a semi-transparent view of the house — the implication being that the player has taken the key despite the warning, and something is now following them out. Key #3 unlocks this door, and opening it ends the game: the player's past (the Screamer) leaves the house together with them. If the game is well received, the story continues from this point; otherwise this is the final ending.</w:t>
       </w:r>
     </w:p>
     <w:p>
@@ -3768,7 +4074,7 @@
               <w:rPr>
                 <w:rtl w:val="0"/>
               </w:rPr>
-              <w:t xml:space="preserve">Unlock the corridor doors between rooms</w:t>
+              <w:t>Unlock the corridor doors between rooms; used immediately on the door, so they never take an inventory slot</w:t>
             </w:r>
           </w:p>
         </w:tc>
@@ -3853,7 +4159,7 @@
               <w:rPr>
                 <w:rtl w:val="0"/>
               </w:rPr>
-              <w:t xml:space="preserve">Narrative — no mechanical effect, purely story</w:t>
+              <w:t>Narrative — no mechanical effect, purely story; stored in the journal</w:t>
             </w:r>
           </w:p>
         </w:tc>
@@ -3938,7 +4244,7 @@
               <w:rPr>
                 <w:rtl w:val="0"/>
               </w:rPr>
-              <w:t xml:space="preserve">Consumed with </w:t>
+              <w:t>Carried and eaten when the player chooses; restores 20 Health. The first time food is picked up, a one-time tutorial prompt teaches how to eat it.</w:t>
             </w:r>
             <w:r>
               <w:rPr>
@@ -3946,13 +4252,11 @@
                 <w:bCs w:val="1"/>
                 <w:rtl w:val="0"/>
               </w:rPr>
-              <w:t xml:space="preserve">E</w:t>
-            </w:r>
-            <w:r>
-              <w:rPr>
-                <w:rtl w:val="0"/>
-              </w:rPr>
-              <w:t xml:space="preserve">; restores 20 Health</w:t>
+            </w:r>
+            <w:r>
+              <w:rPr>
+                <w:rtl w:val="0"/>
+              </w:rPr>
             </w:r>
           </w:p>
         </w:tc>
@@ -4037,7 +4341,7 @@
               <w:rPr>
                 <w:rtl w:val="0"/>
               </w:rPr>
-              <w:t xml:space="preserve">Required to light candles and torches</w:t>
+              <w:t>Required to see in the dark and to light candles and torches</w:t>
             </w:r>
           </w:p>
         </w:tc>
@@ -4076,7 +4380,7 @@
         <w:rPr>
           <w:rtl w:val="0"/>
         </w:rPr>
-        <w:t xml:space="preserve">The inventory is a </w:t>
+        <w:t xml:space="preserve">There is no slot-based inventory. Keys are used immediately, and pages are kept in the </w:t>
       </w:r>
       <w:r>
         <w:rPr>
@@ -4084,13 +4388,13 @@
           <w:bCs w:val="1"/>
           <w:rtl w:val="0"/>
         </w:rPr>
-        <w:t xml:space="preserve">4-slot carousel</w:t>
-      </w:r>
-      <w:r>
-        <w:rPr>
-          <w:rtl w:val="0"/>
-        </w:rPr>
-        <w:t xml:space="preserve"> (Tab to open), holding pages, food, keys, and matches together — simple enough that the player never has to manage capacity or make discard decisions.</w:t>
+        <w:t>journal</w:t>
+      </w:r>
+      <w:r>
+        <w:rPr>
+          <w:rtl w:val="0"/>
+        </w:rPr>
+        <w:t xml:space="preserve"> (Tab to open), which lists every note found so far, as in Amnesia. Food and matches are carried without a capacity limit, so the player never has to manage space or make discard decisions. The exact way the player chooses to eat food (input or menu) is still to be decided.</w:t>
       </w:r>
     </w:p>
     <w:p>
@@ -5568,13 +5872,13 @@
           <w:bCs w:val="1"/>
           <w:rtl w:val="0"/>
         </w:rPr>
-        <w:t xml:space="preserve">Inventory carousel:</w:t>
-      </w:r>
-      <w:r>
-        <w:rPr>
-          <w:rtl w:val="0"/>
-        </w:rPr>
-        <w:t xml:space="preserve"> Opens center-screen on Tab press; displays 4 slots (pages, food, keys, matches).</w:t>
+        <w:t>Journal:</w:t>
+      </w:r>
+      <w:r>
+        <w:rPr>
+          <w:rtl w:val="0"/>
+        </w:rPr>
+        <w:t xml:space="preserve"> Opens on Tab press and shows a list of all collected notes. Selecting a note opens the pages viewer. The game pauses while the journal or the pages viewer is open (no fear damage, no Stamina change), but the audio keeps playing.</w:t>
       </w:r>
     </w:p>
     <w:p>
@@ -5598,7 +5902,31 @@
         <w:rPr>
           <w:rtl w:val="0"/>
         </w:rPr>
-        <w:t xml:space="preserve"> A cruppet sheet of paper appears in the center of the screen. To help the player read the difficult handwriting, a text with a blurred background will be placed over it; closes with Escape.</w:t>
+        <w:t xml:space="preserve"> A crumpled sheet of paper appears in the center of the screen. To help the player read the difficult handwriting, a text with a blurred background will be placed over it; closes with Escape.</w:t>
+      </w:r>
+    </w:p>
+    <w:p>
+      <w:pPr>
+        <w:numPr>
+          <w:ilvl w:val="0"/>
+          <w:numId w:val="3"/>
+        </w:numPr>
+        <w:ind w:left="720" w:hanging="360"/>
+        <w:rPr/>
+      </w:pPr>
+      <w:r>
+        <w:rPr>
+          <w:b w:val="1"/>
+          <w:bCs w:val="1"/>
+          <w:rtl w:val="0"/>
+        </w:rPr>
+        <w:t>Damage feedback:</w:t>
+      </w:r>
+      <w:r>
+        <w:rPr>
+          <w:rtl w:val="0"/>
+        </w:rPr>
+        <w:t xml:space="preserve"> Red blotches flash across the whole screen each time the player loses Health (see 3.4).</w:t>
       </w:r>
     </w:p>
     <w:p>
@@ -5876,7 +6204,7 @@
         <w:rPr>
           <w:rtl w:val="0"/>
         </w:rPr>
-        <w:t xml:space="preserve"> Godot 4.6</w:t>
+        <w:t xml:space="preserve"> Godot 4.7</w:t>
       </w:r>
     </w:p>
     <w:p>
@@ -6342,6 +6670,22 @@
           <w:rtl w:val="0"/>
         </w:rPr>
         <w:t xml:space="preserve">A short epilogue room or alternate ending reflecting the consequence of taking (or refusing) the key</w:t>
+      </w:r>
+    </w:p>
+    <w:p>
+      <w:pPr>
+        <w:numPr>
+          <w:ilvl w:val="0"/>
+          <w:numId w:val="3"/>
+        </w:numPr>
+        <w:ind w:left="720" w:hanging="360"/>
+        <w:rPr/>
+      </w:pPr>
+      <w:r>
+        <w:rPr>
+          <w:rtl w:val="0"/>
+        </w:rPr>
+        <w:t>A continuation of the story that starts at the moment the final door opens, if the game is well received</w:t>
       </w:r>
     </w:p>
     <w:p>
@@ -10813,7 +11157,7 @@
               <w:rPr>
                 <w:rtl w:val="0"/>
               </w:rPr>
-              <w:t xml:space="preserve">Screamer hits player</w:t>
+              <w:t>Screamer hits player; fear damage</w:t>
             </w:r>
           </w:p>
         </w:tc>
@@ -11904,7 +12248,7 @@
               <w:rPr>
                 <w:rtl w:val="0"/>
               </w:rPr>
-              <w:t xml:space="preserve">Inventory open / close</w:t>
+              <w:t>Journal open / close</w:t>
             </w:r>
           </w:p>
         </w:tc>

</xml_diff>